<commit_message>
Minor updates of H-Brücke
</commit_message>
<xml_diff>
--- a/_book/HWE-Skript.docx
+++ b/_book/HWE-Skript.docx
@@ -29,7 +29,7 @@
         <w:pStyle w:val="Date"/>
       </w:pPr>
       <w:r>
-        <w:t xml:space="preserve">2024-01-19</w:t>
+        <w:t xml:space="preserve">2024-01-20</w:t>
       </w:r>
     </w:p>
     <w:sdt>
@@ -5622,6 +5622,22 @@
       </w:pPr>
       <m:oMath>
         <m:r>
+          <m:t>Y</m:t>
+        </m:r>
+      </m:oMath>
+      <w:r>
+        <w:t xml:space="preserve"> </w:t>
+      </w:r>
+      <w:r>
+        <w:t xml:space="preserve">… Y Ausgang</w:t>
+      </w:r>
+    </w:p>
+    <w:p>
+      <w:pPr>
+        <w:pStyle w:val="BodyText"/>
+      </w:pPr>
+      <m:oMath>
+        <m:r>
           <m:t>B</m:t>
         </m:r>
       </m:oMath>
@@ -5630,6 +5646,22 @@
       </w:r>
       <w:r>
         <w:t xml:space="preserve">… B Eingang</w:t>
+      </w:r>
+    </w:p>
+    <w:p>
+      <w:pPr>
+        <w:pStyle w:val="BodyText"/>
+      </w:pPr>
+      <m:oMath>
+        <m:r>
+          <m:t>A</m:t>
+        </m:r>
+      </m:oMath>
+      <w:r>
+        <w:t xml:space="preserve"> </w:t>
+      </w:r>
+      <w:r>
+        <w:t xml:space="preserve">… A Eingang</w:t>
       </w:r>
     </w:p>
     <w:p>
@@ -5662,38 +5694,6 @@
       </w:r>
       <w:r>
         <w:t xml:space="preserve">… C Eingang</w:t>
-      </w:r>
-    </w:p>
-    <w:p>
-      <w:pPr>
-        <w:pStyle w:val="BodyText"/>
-      </w:pPr>
-      <m:oMath>
-        <m:r>
-          <m:t>Y</m:t>
-        </m:r>
-      </m:oMath>
-      <w:r>
-        <w:t xml:space="preserve"> </w:t>
-      </w:r>
-      <w:r>
-        <w:t xml:space="preserve">… Y Ausgang</w:t>
-      </w:r>
-    </w:p>
-    <w:p>
-      <w:pPr>
-        <w:pStyle w:val="BodyText"/>
-      </w:pPr>
-      <m:oMath>
-        <m:r>
-          <m:t>A</m:t>
-        </m:r>
-      </m:oMath>
-      <w:r>
-        <w:t xml:space="preserve"> </w:t>
-      </w:r>
-      <w:r>
-        <w:t xml:space="preserve">… A Eingang</w:t>
       </w:r>
     </w:p>
     <w:p>
@@ -16915,90 +16915,7 @@
         <w:t xml:space="preserve"> </w:t>
       </w:r>
       <w:r>
-        <w:t xml:space="preserve">überschreitet. In Bild</w:t>
-      </w:r>
-      <w:r>
-        <w:t xml:space="preserve"> </w:t>
-      </w:r>
-      <w:hyperlink w:anchor="fig-H-BrueckeMS">
-        <w:r>
-          <w:rPr>
-            <w:rStyle w:val="Hyperlink"/>
-          </w:rPr>
-          <w:t xml:space="preserve">Abbildung 4.2</w:t>
-        </w:r>
-      </w:hyperlink>
-      <w:r>
-        <w:t xml:space="preserve"> </w:t>
-      </w:r>
-      <w:r>
-        <w:t xml:space="preserve">sind alle Schalter offen. Da es sich um N-Kanal Selbstsperrende MOSFET handelt müssen, für diesen Zustand, alle Potentiale,</w:t>
-      </w:r>
-      <w:r>
-        <w:t xml:space="preserve"> </w:t>
-      </w:r>
-      <m:oMath>
-        <m:sSub>
-          <m:e>
-            <m:r>
-              <m:t>S</m:t>
-            </m:r>
-          </m:e>
-          <m:sub>
-            <m:r>
-              <m:t>1</m:t>
-            </m:r>
-          </m:sub>
-        </m:sSub>
-      </m:oMath>
-      <w:r>
-        <w:t xml:space="preserve"> </w:t>
-      </w:r>
-      <w:r>
-        <w:t xml:space="preserve">bis</w:t>
-      </w:r>
-      <w:r>
-        <w:t xml:space="preserve"> </w:t>
-      </w:r>
-      <m:oMath>
-        <m:sSub>
-          <m:e>
-            <m:r>
-              <m:t>S</m:t>
-            </m:r>
-          </m:e>
-          <m:sub>
-            <m:r>
-              <m:t>4</m:t>
-            </m:r>
-          </m:sub>
-        </m:sSub>
-      </m:oMath>
-      <w:r>
-        <w:t xml:space="preserve">,</w:t>
-      </w:r>
-      <w:r>
-        <w:t xml:space="preserve"> </w:t>
-      </w:r>
-      <m:oMath>
-        <m:r>
-          <m:t>0</m:t>
-        </m:r>
-        <m:r>
-          <m:t> </m:t>
-        </m:r>
-        <m:r>
-          <m:rPr>
-            <m:sty m:val="p"/>
-          </m:rPr>
-          <m:t>V</m:t>
-        </m:r>
-      </m:oMath>
-      <w:r>
-        <w:t xml:space="preserve"> </w:t>
-      </w:r>
-      <w:r>
-        <w:t xml:space="preserve">sein.</w:t>
+        <w:t xml:space="preserve">überschreitet.</w:t>
       </w:r>
     </w:p>
     <w:p>
@@ -17101,7 +17018,7 @@
         <w:pStyle w:val="BodyText"/>
       </w:pPr>
       <w:r>
-        <w:t xml:space="preserve">Potential</w:t>
+        <w:t xml:space="preserve">Transistoren</w:t>
       </w:r>
       <w:r>
         <w:t xml:space="preserve"> </w:t>
@@ -17147,7 +17064,7 @@
         <w:t xml:space="preserve"> </w:t>
       </w:r>
       <w:r>
-        <w:t xml:space="preserve">müssen auf HIGH sein. Potential</w:t>
+        <w:t xml:space="preserve">müssen durchschalten. Transistoren</w:t>
       </w:r>
       <w:r>
         <w:t xml:space="preserve"> </w:t>
@@ -17193,7 +17110,7 @@
         <w:t xml:space="preserve"> </w:t>
       </w:r>
       <w:r>
-        <w:t xml:space="preserve">müssen auf LOW sein.</w:t>
+        <w:t xml:space="preserve">müssen gesperrt sein.</w:t>
       </w:r>
     </w:p>
     <w:bookmarkEnd w:id="200"/>
@@ -17289,7 +17206,7 @@
         <w:pStyle w:val="BodyText"/>
       </w:pPr>
       <w:r>
-        <w:t xml:space="preserve">Potential</w:t>
+        <w:t xml:space="preserve">Transistoren</w:t>
       </w:r>
       <w:r>
         <w:t xml:space="preserve"> </w:t>
@@ -17335,7 +17252,7 @@
         <w:t xml:space="preserve"> </w:t>
       </w:r>
       <w:r>
-        <w:t xml:space="preserve">müssen auf HIGH sein. Potential</w:t>
+        <w:t xml:space="preserve">müssen durchschalten. Transistoren</w:t>
       </w:r>
       <w:r>
         <w:t xml:space="preserve"> </w:t>
@@ -17381,7 +17298,7 @@
         <w:t xml:space="preserve"> </w:t>
       </w:r>
       <w:r>
-        <w:t xml:space="preserve">müssen auf LOW sein.</w:t>
+        <w:t xml:space="preserve">müssen gesperrt sein.</w:t>
       </w:r>
     </w:p>
     <w:bookmarkEnd w:id="205"/>
@@ -17399,7 +17316,7 @@
         <w:pStyle w:val="FirstParagraph"/>
       </w:pPr>
       <w:r>
-        <w:t xml:space="preserve">Um den Motor zu bremsen muss er Kurzgeschlossen werden. Daraus ergibt sich, dass Potential</w:t>
+        <w:t xml:space="preserve">Um den Motor zu bremsen muss er Kurzgeschlossen werden. Daraus ergibt sich, dass die Transistoren</w:t>
       </w:r>
       <w:r>
         <w:t xml:space="preserve"> </w:t>
@@ -17445,7 +17362,7 @@
         <w:t xml:space="preserve"> </w:t>
       </w:r>
       <w:r>
-        <w:t xml:space="preserve">auf HIGH sind und Potential</w:t>
+        <w:t xml:space="preserve">durchgeschaltet sind und die Transistoren</w:t>
       </w:r>
       <w:r>
         <w:t xml:space="preserve"> </w:t>
@@ -17491,7 +17408,7 @@
         <w:t xml:space="preserve"> </w:t>
       </w:r>
       <w:r>
-        <w:t xml:space="preserve">auf LOW sind.</w:t>
+        <w:t xml:space="preserve">gesperrt sind.</w:t>
       </w:r>
     </w:p>
     <w:tbl>
@@ -17922,7 +17839,7 @@
               <w:jc w:val="left"/>
             </w:pPr>
             <w:r>
-              <w:t xml:space="preserve">PWM Signal für die Transistoren.</w:t>
+              <w:t xml:space="preserve">Steuersignal für die Transistoren, diese entsprechen noch nicht dem benötigten Potentialen!</w:t>
             </w:r>
           </w:p>
         </w:tc>

</xml_diff>